<commit_message>
docs: update frontend roadmap to T-Bank Light theme style
</commit_message>
<xml_diff>
--- a/docs/FRONTEND_ROADMAP_NIKITA.docx
+++ b/docs/FRONTEND_ROADMAP_NIKITA.docx
@@ -25,11 +25,11 @@
         <w:rPr>
           <w:b/>
           <w:color w:val="0F172A"/>
-          <w:sz w:val="32"/>
+          <w:sz w:val="31"/>
         </w:rPr>
         <w:t>ТЕХНИЧЕСКОЕ ЗАДАНИЕ И РОАДМАП</w:t>
         <w:br/>
-        <w:t>РАЗРАБОТКА FRONTEND-ТЕРМИНАЛА (REACT / TYPESCRIPT)</w:t>
+        <w:t>РАЗРАБОТКА FRONTEND-ТЕРМИНАЛА (СВЕТЛАЯ ТЕМА / T-BANK LIGHT)</w:t>
       </w:r>
     </w:p>
     <w:p>
@@ -43,7 +43,7 @@
           <w:color w:val="2563EB"/>
           <w:sz w:val="21"/>
         </w:rPr>
-        <w:t>Исполнитель: Никита (Frontend Lead) • Стек: React (Vite) + TypeScript + Tailwind CSS</w:t>
+        <w:t>Исполнитель: Никита (Frontend Lead) • Стиль: T-Bank Light / Apple Finance • Стек: React + Vite + TS</w:t>
       </w:r>
     </w:p>
     <w:p>
@@ -69,7 +69,7 @@
           <w:color w:val="0F294A"/>
           <w:sz w:val="30"/>
         </w:rPr>
-        <w:t>1. Дизайн-система и цветовая палитра</w:t>
+        <w:t>1. Дизайн-система и цветовая палитра (T-Bank Light Style)</w:t>
       </w:r>
     </w:p>
     <w:p>
@@ -78,7 +78,7 @@
         <w:jc w:val="both"/>
       </w:pPr>
       <w:r>
-        <w:t>Стиль интерфейса: Modern Institutional Dark (в духе Bloomberg Modern, Linear, Stripe Treasury). Профессиональный сдержанный темный режим для многочасовой работы советника:</w:t>
+        <w:t>Интерфейс терминала строится строго в светлой эстетике передовых российских финтех-сервисов (Т-Банк Инвестиции, Т-Бизнес): белоснежные поверхности, мягкие светлые тени, высокая контрастность цифр и аккуратные бейджи.</w:t>
       </w:r>
     </w:p>
     <w:p>
@@ -92,10 +92,10 @@
         <w:rPr>
           <w:b/>
         </w:rPr>
-        <w:t xml:space="preserve">Фон приложения (Obsidian Base): </w:t>
+        <w:t xml:space="preserve">Фон страницы (Page Background): </w:t>
       </w:r>
       <w:r>
-        <w:t>Глубокий графитово-черный #0B0F19.</w:t>
+        <w:t>Мягкий молочно-серый #F5F6F8 (комфорт для глаз, без слепящей белизны).</w:t>
       </w:r>
     </w:p>
     <w:p>
@@ -109,10 +109,10 @@
         <w:rPr>
           <w:b/>
         </w:rPr>
-        <w:t xml:space="preserve">Карточки и поверхности (Surface): </w:t>
+        <w:t xml:space="preserve">Карточки и блоки (Card Surface): </w:t>
       </w:r>
       <w:r>
-        <w:t>Темно-графитовый #161B22 с тонкой 1px границей #2D333B.</w:t>
+        <w:t>Чистый белый #FFFFFF с тонкой аккуратной границей 1px #E5E7EB и легкой тенью (shadow-sm).</w:t>
       </w:r>
     </w:p>
     <w:p>
@@ -126,10 +126,44 @@
         <w:rPr>
           <w:b/>
         </w:rPr>
-        <w:t xml:space="preserve">Основной акцент (Brand Blue): </w:t>
+        <w:t xml:space="preserve">Основной текст: </w:t>
       </w:r>
       <w:r>
-        <w:t>Холодный королевский синий #2563EB / #3B82F6.</w:t>
+        <w:t>Глубокий графитовый / темно-серый #111827.</w:t>
+      </w:r>
+    </w:p>
+    <w:p>
+      <w:pPr>
+        <w:pStyle w:val="ListBullet"/>
+        <w:spacing w:after="60"/>
+        <w:ind w:firstLine="0" w:left="706"/>
+        <w:jc w:val="left"/>
+      </w:pPr>
+      <w:r>
+        <w:rPr>
+          <w:b/>
+        </w:rPr>
+        <w:t xml:space="preserve">Второстепенный текст и подписи: </w:t>
+      </w:r>
+      <w:r>
+        <w:t>Нейтральный серый #6B7280.</w:t>
+      </w:r>
+    </w:p>
+    <w:p>
+      <w:pPr>
+        <w:pStyle w:val="ListBullet"/>
+        <w:spacing w:after="60"/>
+        <w:ind w:firstLine="0" w:left="706"/>
+        <w:jc w:val="left"/>
+      </w:pPr>
+      <w:r>
+        <w:rPr>
+          <w:b/>
+        </w:rPr>
+        <w:t xml:space="preserve">Фирменный акцент (Brand Blue): </w:t>
+      </w:r>
+      <w:r>
+        <w:t>Классический банковский синий #2563EB для активных кнопок и табов.</w:t>
       </w:r>
     </w:p>
     <w:p>
@@ -146,7 +180,7 @@
         <w:t xml:space="preserve">Статусные цвета рисков: </w:t>
       </w:r>
       <w:r>
-        <w:t>Изумрудный #10B981 (безопасно/консервативный), Янтарный #F59E0B (умеренный риск), Карминный #EF4444 (высокий риск/акции).</w:t>
+        <w:t>Пастельные плашки с ярким текстом: Изумрудный #059669 (фон #ECFDF5) — консервативный/ОФЗ; Янтарный #D97706 (фон #FFFBEB) — умеренный риск; Карминный #DC2626 (фон #FEF2F2) — агрессивный риск.</w:t>
       </w:r>
     </w:p>
     <w:p>
@@ -163,7 +197,7 @@
         <w:t xml:space="preserve">Типографика: </w:t>
       </w:r>
       <w:r>
-        <w:t>Интерфейсный текст — Inter / SF Pro; моноширинный для цифр и котировок — JetBrains Mono.</w:t>
+        <w:t>Интерфейсный текст — Inter / SF Pro; моноширинный для тикеров и цифр — JetBrains Mono.</w:t>
       </w:r>
     </w:p>
     <w:p>
@@ -189,7 +223,7 @@
         <w:jc w:val="both"/>
       </w:pPr>
       <w:r>
-        <w:t>Цель сплита: Развернуть скелет приложения, настроить маршрутизацию и закрыть двухфакторную банковскую авторизацию.</w:t>
+        <w:t>Цель сплита: Развернуть скелет приложения в светлой теме, настроить маршрутизацию и закрыть двухфакторную банковскую авторизацию.</w:t>
       </w:r>
     </w:p>
     <w:p>
@@ -206,7 +240,7 @@
         <w:t xml:space="preserve">1. Инициализация: </w:t>
       </w:r>
       <w:r>
-        <w:t>Инициализация проекта через Vite (React + TypeScript), настройка путей (@/components) и темной темы.</w:t>
+        <w:t>Инициализация проекта через Vite (React + TypeScript), настройка путей (@/components) и конфигурации светлой темы T-Bank Light.</w:t>
       </w:r>
     </w:p>
     <w:p>
@@ -223,7 +257,7 @@
         <w:t xml:space="preserve">2. Экран входа (/login): </w:t>
       </w:r>
       <w:r>
-        <w:t>Поля Email и Пароль. Отправка POST-запроса на /api/v1/auth/login/.</w:t>
+        <w:t>Аккуратная белая карточка по центру экрана, поля Email и Пароль. Отправка POST-запроса на /api/v1/auth/login/.</w:t>
       </w:r>
     </w:p>
     <w:p>
@@ -283,7 +317,7 @@
         <w:jc w:val="both"/>
       </w:pPr>
       <w:r>
-        <w:t>Результат сплита: Пользователь успешно проходит двухфакторный вход и попадает в пустую рабочую зону.</w:t>
+        <w:t>Результат сплита: Пользователь успешно проходит двухфакторный вход и попадает в пустую светлую рабочую зону.</w:t>
       </w:r>
     </w:p>
     <w:p>
@@ -309,7 +343,7 @@
         <w:jc w:val="both"/>
       </w:pPr>
       <w:r>
-        <w:t>Цель сплита: Создание рабочего места советника — реестра клиентов и управления активами.</w:t>
+        <w:t>Цель сплита: Создание рабочего места советника — реестра клиентов в стиле современного онлайн-банкинга.</w:t>
       </w:r>
     </w:p>
     <w:p>
@@ -326,7 +360,7 @@
         <w:t xml:space="preserve">1. Хедер терминала: </w:t>
       </w:r>
       <w:r>
-        <w:t>Логотип Aegis Wealth, имя советника, индикатор сессии и кнопка безопасного выхода.</w:t>
+        <w:t>Светлый фон #FFFFFF, логотип Aegis Wealth, имя советника, индикатор сессии и кнопка безопасного выхода.</w:t>
       </w:r>
     </w:p>
     <w:p>
@@ -343,7 +377,7 @@
         <w:t xml:space="preserve">2. Реестр инвесторов (/clients): </w:t>
       </w:r>
       <w:r>
-        <w:t>Таблица клиентов советника по запросу GET /api/v1/clients/. Колонки: ФИО, совокупный AUM (активы под управлением), бейдж риск-профиля (консервативный / умеренный / агрессивный), количество счетов.</w:t>
+        <w:t>Контрастная белая таблица клиентов по запросу GET /api/v1/clients/. Колонки: ФИО, совокупный AUM (активы под управлением), бейдж риск-профиля (консервативный / умеренный / агрессивный), количество счетов.</w:t>
       </w:r>
     </w:p>
     <w:p>
@@ -455,7 +489,7 @@
         <w:t xml:space="preserve">Карточки ключевых метрик: </w:t>
       </w:r>
       <w:r>
-        <w:t>Общая стоимость (AUM), индекс концентрации HHI с цветовой индикацией уровня риска (low, moderate, high), топ-актив портфеля.</w:t>
+        <w:t>Белые карточки с мягкой тенью: Общая стоимость (AUM), индекс концентрации HHI с цветовой шкалой риска (low, moderate, high), топ-актив портфеля.</w:t>
       </w:r>
     </w:p>
     <w:p>
@@ -472,7 +506,7 @@
         <w:t xml:space="preserve">Круговая диаграмма: </w:t>
       </w:r>
       <w:r>
-        <w:t>Donut Chart (Recharts) распределения долей: акции, облигации, фонды, валютная ликвидность.</w:t>
+        <w:t>Donut Chart (Recharts) на светлом фоне: четкое распределение долей (акции, облигации, фонды, валютная ликвидность).</w:t>
       </w:r>
     </w:p>
     <w:p>
@@ -489,7 +523,7 @@
         <w:t xml:space="preserve">Таблица позиций: </w:t>
       </w:r>
       <w:r>
-        <w:t>Интерактивная таблица активов (тикер, наименование, текущая цена, доля в процентах).</w:t>
+        <w:t>Интерактивная таблица активов с чередующимися строками (тикер, наименование, текущая цена, доля в процентах).</w:t>
       </w:r>
     </w:p>
     <w:p>
@@ -541,7 +575,7 @@
         <w:jc w:val="both"/>
       </w:pPr>
       <w:r>
-        <w:t>Результат сплита: Полностью функционирующий расчетный дашборд с интерактивным пересчетом метрик на лету.</w:t>
+        <w:t>Результат сплита: Полностью функционирующий светлый расчетный дашборд с интерактивным пересчетом метрик на лету.</w:t>
       </w:r>
     </w:p>
     <w:p>
@@ -618,7 +652,7 @@
         <w:t xml:space="preserve">3. Полировка интерфейса: </w:t>
       </w:r>
       <w:r>
-        <w:t>Экраны пустых состояний (Empty States) при отсутствии загруженного портфеля, плавные микроанимации пересчета метрик, полировка контраста и отступов.</w:t>
+        <w:t>Экраны пустых состояний (Empty States) с дружелюбными векторными иллюстрациями, микроанимации пересчета метрик, полировка отступов под мониторы советников.</w:t>
       </w:r>
     </w:p>
     <w:p>
@@ -627,7 +661,7 @@
         <w:jc w:val="both"/>
       </w:pPr>
       <w:r>
-        <w:t>Результат сплита: 100% готовый интерфейс Wealth-терминала, полностью готовый к демонстрации и промышленному внедрению.</w:t>
+        <w:t>Результат сплита: 100% готовый интерфейс Wealth-терминала в чистом светлом стиле Т-Банка.</w:t>
       </w:r>
     </w:p>
     <w:sectPr>
@@ -1008,7 +1042,7 @@
     </w:pPr>
     <w:rPr>
       <w:rFonts w:ascii="Times New Roman" w:hAnsi="Times New Roman"/>
-      <w:color w:val="1A1A1A"/>
+      <w:color w:val="111827"/>
       <w:sz w:val="26"/>
     </w:rPr>
   </w:style>

</xml_diff>